<commit_message>
Point all surfaces at the fresh round-three Google Doc
The old Working Notes doc (1gM5Knlq...) carried pre-round-three text,
including the removed career-fair claim; a new doc was generated from
the corrected notes and all links now target it.

Co-Authored-By: Claude Fable 5 <noreply@anthropic.com>
</commit_message>
<xml_diff>
--- a/output/doc/DESN Program Review Self-Study Notes.docx
+++ b/output/doc/DESN Program Review Self-Study Notes.docx
@@ -100,35 +100,16 @@
           <w:spacing w:val="0"/>
           <w:color w:val="0000E9"/>
         </w:rPr>
-        <w:t xml:space="preserve">https://docs.google.com/document/d/1gM5KnlqEmtQY-Qy1J65UNwyB7qFhG4kNHwoGny62YjA/edit</w:t>
-      </w:r>
-      <w:r>
-        <w:rPr>
-          <w:rFonts w:ascii="Times" w:hAnsi="Times" w:cs="Times"/>
-          <w:sz w:val="24"/>
-          <w:sz-cs w:val="24"/>
-          <w:spacing w:val="0"/>
-        </w:rPr>
-        <w:t xml:space="preserve"> — supersedes the earlier answers-only Draft Answers doc. </w:t>
-      </w:r>
-      <w:r>
-        <w:rPr>
-          <w:rFonts w:ascii="Times" w:hAnsi="Times" w:cs="Times"/>
-          <w:sz w:val="24"/>
-          <w:sz-cs w:val="24"/>
-          <w:b/>
-          <w:spacing w:val="0"/>
-        </w:rPr>
-        <w:t xml:space="preserve">Note: the Google Doc still carries the pre-round-three text — refresh it from these answers.</w:t>
-      </w:r>
-      <w:r>
-        <w:rPr>
-          <w:rFonts w:ascii="Times" w:hAnsi="Times" w:cs="Times"/>
-          <w:sz w:val="24"/>
-          <w:sz-cs w:val="24"/>
-          <w:spacing w:val="0"/>
-        </w:rPr>
-        <w:t xml:space="preserve"/>
+        <w:t xml:space="preserve">https://docs.google.com/document/d/1T1_7CJhKBZVcoV-WkgVGAq5QT42V6NSuKFACfrOYJl4/edit</w:t>
+      </w:r>
+      <w:r>
+        <w:rPr>
+          <w:rFonts w:ascii="Times" w:hAnsi="Times" w:cs="Times"/>
+          <w:sz w:val="24"/>
+          <w:sz-cs w:val="24"/>
+          <w:spacing w:val="0"/>
+        </w:rPr>
+        <w:t xml:space="preserve"> — fresh round-three copy generated July 15, 2026; supersedes the earlier July 15 Working Notes doc (1gM5Knlq…) and the answers-only Draft Answers doc.</w:t>
       </w:r>
     </w:p>
     <w:p>
@@ -1431,7 +1412,7 @@
           <w:sz-cs w:val="24"/>
           <w:spacing w:val="0"/>
         </w:rPr>
-        <w:t xml:space="preserve">9. Refresh the Google Doc with the round-three answers (it still carries the pre-round-three text).</w:t>
+        <w:t xml:space="preserve">9. Share the fresh round-three Google Doc with the chair, and trash (or clearly mark superseded) the old July 15 doc (1gM5Knlq…) so nobody edits the stale copy.</w:t>
       </w:r>
     </w:p>
     <w:p>

</xml_diff>

<commit_message>
Point Google Doc links at the shared editing copy
Co-Authored-By: Claude Fable 5 <noreply@anthropic.com>
</commit_message>
<xml_diff>
--- a/output/doc/DESN Program Review Self-Study Notes.docx
+++ b/output/doc/DESN Program Review Self-Study Notes.docx
@@ -100,16 +100,16 @@
           <w:spacing w:val="0"/>
           <w:color w:val="0000E9"/>
         </w:rPr>
-        <w:t xml:space="preserve">https://docs.google.com/document/d/1T1_7CJhKBZVcoV-WkgVGAq5QT42V6NSuKFACfrOYJl4/edit</w:t>
-      </w:r>
-      <w:r>
-        <w:rPr>
-          <w:rFonts w:ascii="Times" w:hAnsi="Times" w:cs="Times"/>
-          <w:sz w:val="24"/>
-          <w:sz-cs w:val="24"/>
-          <w:spacing w:val="0"/>
-        </w:rPr>
-        <w:t xml:space="preserve"> — fresh round-three copy generated July 15, 2026; supersedes the earlier July 15 Working Notes doc (1gM5Knlq…) and the answers-only Draft Answers doc.</w:t>
+        <w:t xml:space="preserve">https://docs.google.com/document/d/1z_aoUouN0hIlui5FC4tPryZsHjfoe8HD60Fdvq40Xb4/edit?usp=sharing</w:t>
+      </w:r>
+      <w:r>
+        <w:rPr>
+          <w:rFonts w:ascii="Times" w:hAnsi="Times" w:cs="Times"/>
+          <w:sz w:val="24"/>
+          <w:sz-cs w:val="24"/>
+          <w:spacing w:val="0"/>
+        </w:rPr>
+        <w:t xml:space="preserve"> — canonical round-three editing copy (July 15, 2026); supersedes the generated round-three doc (1T1_7CJ…), the earlier July 15 Working Notes doc (1gM5Knlq…), and the answers-only Draft Answers doc.</w:t>
       </w:r>
     </w:p>
     <w:p>

</xml_diff>